<commit_message>
fix(SWUSim): account fixes and engine bug fixes
</commit_message>
<xml_diff>
--- a/docs/TCGEngine_Remote_Frontend_Integration_Guide.docx
+++ b/docs/TCGEngine_Remote_Frontend_Integration_Guide.docx
@@ -2405,7 +2405,7 @@
                 <w:color w:val="172033"/>
                 <w:sz w:val="18"/>
               </w:rPr>
-              <w:t>Replay initial state</w:t>
+              <w:t>Replay initial state — always '-' (server-only; save replays via APIs/MatchReplay.php)</w:t>
             </w:r>
           </w:p>
         </w:tc>
@@ -2443,7 +2443,7 @@
                 <w:color w:val="172033"/>
                 <w:sz w:val="18"/>
               </w:rPr>
-              <w:t>Replay commands</w:t>
+              <w:t>Replay commands — always '-' (server-only)</w:t>
             </w:r>
           </w:p>
         </w:tc>
@@ -4261,7 +4261,7 @@
           <w:color w:val="172033"/>
           <w:sz w:val="22"/>
         </w:rPr>
-        <w:t>Core/jsInclude.js and Core/UILibraries20260709.js: current browser action serialization, decision UI, chat behavior, and zone rendering conventions.</w:t>
+        <w:t>Core/jsInclude.js and Core/UILibraries20261001.js: current browser action serialization, decision UI, chat behavior, and zone rendering conventions.</w:t>
       </w:r>
     </w:p>
     <w:p>

</xml_diff>